<commit_message>
SN 2 More Missing Ans
</commit_message>
<xml_diff>
--- a/SN - Social Networks/SN_Missing_Answers.docx
+++ b/SN - Social Networks/SN_Missing_Answers.docx
@@ -163,8 +163,20 @@
                 <w:sz w:val="28"/>
                 <w:szCs w:val="28"/>
               </w:rPr>
-              <w:t>Social Networking and Social Media</w:t>
-            </w:r>
+              <w:t xml:space="preserve">Social Networking and </w:t>
+            </w:r>
+            <w:proofErr w:type="gramStart"/>
+            <w:r>
+              <w:rPr>
+                <w:rFonts w:asciiTheme="minorHAnsi" w:hAnsiTheme="minorHAnsi" w:cstheme="minorHAnsi"/>
+                <w:b/>
+                <w:bCs/>
+                <w:sz w:val="28"/>
+                <w:szCs w:val="28"/>
+              </w:rPr>
+              <w:t>Social Media</w:t>
+            </w:r>
+            <w:proofErr w:type="gramEnd"/>
           </w:p>
         </w:tc>
       </w:tr>
@@ -282,6 +294,7 @@
                       <w:szCs w:val="28"/>
                     </w:rPr>
                   </w:pPr>
+                  <w:proofErr w:type="gramStart"/>
                   <w:r>
                     <w:rPr>
                       <w:rFonts w:asciiTheme="minorHAnsi" w:hAnsiTheme="minorHAnsi" w:cstheme="minorHAnsi"/>
@@ -290,6 +303,7 @@
                     </w:rPr>
                     <w:t>Social Media</w:t>
                   </w:r>
+                  <w:proofErr w:type="gramEnd"/>
                 </w:p>
               </w:tc>
             </w:tr>
@@ -1386,7 +1400,7 @@
                 </mc:Choice>
                 <mc:Fallback>
                   <w:pict>
-                    <v:rect w14:anchorId="6B8BD8BA" id="Rectangle 1" o:spid="_x0000_s1026" style="position:absolute;margin-left:10.2pt;margin-top:3.45pt;width:286.2pt;height:480.6pt;z-index:-251657728;visibility:visible;mso-wrap-style:square;mso-height-percent:0;mso-wrap-distance-left:9pt;mso-wrap-distance-top:0;mso-wrap-distance-right:9pt;mso-wrap-distance-bottom:0;mso-position-horizontal:absolute;mso-position-horizontal-relative:text;mso-position-vertical:absolute;mso-position-vertical-relative:text;mso-height-percent:0;mso-height-relative:margin;v-text-anchor:middle" o:gfxdata="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" fillcolor="black [3200]" strokecolor="black [480]" strokeweight="2pt"/>
+                    <v:rect w14:anchorId="22A90363" id="Rectangle 1" o:spid="_x0000_s1026" style="position:absolute;margin-left:10.2pt;margin-top:3.45pt;width:286.2pt;height:480.6pt;z-index:-251657728;visibility:visible;mso-wrap-style:square;mso-height-percent:0;mso-wrap-distance-left:9pt;mso-wrap-distance-top:0;mso-wrap-distance-right:9pt;mso-wrap-distance-bottom:0;mso-position-horizontal:absolute;mso-position-horizontal-relative:text;mso-position-vertical:absolute;mso-position-vertical-relative:text;mso-height-percent:0;mso-height-relative:margin;v-text-anchor:middle" o:gfxdata="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" fillcolor="black [3200]" strokecolor="black [480]" strokeweight="2pt"/>
                   </w:pict>
                 </mc:Fallback>
               </mc:AlternateContent>
@@ -1471,6 +1485,7 @@
               <w:t xml:space="preserve"> </w:t>
             </w:r>
             <w:proofErr w:type="spellStart"/>
+            <w:proofErr w:type="gramStart"/>
             <w:r>
               <w:rPr>
                 <w:rFonts w:asciiTheme="minorHAnsi" w:hAnsiTheme="minorHAnsi" w:cstheme="minorHAnsi"/>
@@ -1482,6 +1497,7 @@
               <w:t>nx</w:t>
             </w:r>
             <w:proofErr w:type="spellEnd"/>
+            <w:proofErr w:type="gramEnd"/>
           </w:p>
           <w:p>
             <w:pPr>
@@ -2200,6 +2216,7 @@
               <w:t xml:space="preserve"> </w:t>
             </w:r>
             <w:proofErr w:type="spellStart"/>
+            <w:proofErr w:type="gramStart"/>
             <w:r>
               <w:rPr>
                 <w:rFonts w:asciiTheme="minorHAnsi" w:hAnsiTheme="minorHAnsi" w:cstheme="minorHAnsi"/>
@@ -2211,6 +2228,7 @@
               <w:t>plt</w:t>
             </w:r>
             <w:proofErr w:type="spellEnd"/>
+            <w:proofErr w:type="gramEnd"/>
           </w:p>
           <w:p>
             <w:pPr>
@@ -2468,7 +2486,27 @@
                 <w:szCs w:val="28"/>
                 <w:lang w:val="en-IN"/>
               </w:rPr>
-              <w:t xml:space="preserve">In this example, We first import the </w:t>
+              <w:t xml:space="preserve">In this example, </w:t>
+            </w:r>
+            <w:proofErr w:type="gramStart"/>
+            <w:r>
+              <w:rPr>
+                <w:rFonts w:asciiTheme="minorHAnsi" w:hAnsiTheme="minorHAnsi" w:cstheme="minorHAnsi"/>
+                <w:sz w:val="28"/>
+                <w:szCs w:val="28"/>
+                <w:lang w:val="en-IN"/>
+              </w:rPr>
+              <w:t>We</w:t>
+            </w:r>
+            <w:proofErr w:type="gramEnd"/>
+            <w:r>
+              <w:rPr>
+                <w:rFonts w:asciiTheme="minorHAnsi" w:hAnsiTheme="minorHAnsi" w:cstheme="minorHAnsi"/>
+                <w:sz w:val="28"/>
+                <w:szCs w:val="28"/>
+                <w:lang w:val="en-IN"/>
+              </w:rPr>
+              <w:t xml:space="preserve"> first import the </w:t>
             </w:r>
             <w:proofErr w:type="spellStart"/>
             <w:r>
@@ -3463,7 +3501,29 @@
                 <w:sz w:val="28"/>
                 <w:szCs w:val="28"/>
               </w:rPr>
-              <w:t xml:space="preserve">Describe Datasets and its formats.( </w:t>
+              <w:t xml:space="preserve">Describe Datasets and its </w:t>
+            </w:r>
+            <w:proofErr w:type="gramStart"/>
+            <w:r>
+              <w:rPr>
+                <w:rFonts w:asciiTheme="minorHAnsi" w:hAnsiTheme="minorHAnsi" w:cstheme="minorHAnsi"/>
+                <w:b/>
+                <w:bCs/>
+                <w:sz w:val="28"/>
+                <w:szCs w:val="28"/>
+              </w:rPr>
+              <w:t>formats.(</w:t>
+            </w:r>
+            <w:proofErr w:type="gramEnd"/>
+            <w:r>
+              <w:rPr>
+                <w:rFonts w:asciiTheme="minorHAnsi" w:hAnsiTheme="minorHAnsi" w:cstheme="minorHAnsi"/>
+                <w:b/>
+                <w:bCs/>
+                <w:sz w:val="28"/>
+                <w:szCs w:val="28"/>
+              </w:rPr>
+              <w:t xml:space="preserve"> </w:t>
             </w:r>
             <w:proofErr w:type="spellStart"/>
             <w:r>
@@ -4563,8 +4623,6 @@
                     <w:jc w:val="center"/>
                     <w:rPr>
                       <w:rFonts w:asciiTheme="minorHAnsi" w:eastAsia="Times New Roman" w:hAnsiTheme="minorHAnsi" w:cstheme="minorHAnsi"/>
-                      <w:b/>
-                      <w:bCs/>
                       <w:sz w:val="28"/>
                       <w:szCs w:val="28"/>
                       <w:lang w:val="en-IN" w:eastAsia="en-IN"/>
@@ -4573,8 +4631,6 @@
                   <w:r>
                     <w:rPr>
                       <w:rFonts w:asciiTheme="minorHAnsi" w:eastAsia="Times New Roman" w:hAnsiTheme="minorHAnsi" w:cstheme="minorHAnsi"/>
-                      <w:b/>
-                      <w:bCs/>
                       <w:sz w:val="28"/>
                       <w:szCs w:val="28"/>
                       <w:lang w:val="en-IN" w:eastAsia="en-IN"/>
@@ -5053,7 +5109,27 @@
                       <w:szCs w:val="28"/>
                       <w:lang w:val="en-IN" w:eastAsia="en-IN"/>
                     </w:rPr>
-                    <w:t>Individuals choose to form connections with others who are similar to them</w:t>
+                    <w:t xml:space="preserve">Individuals choose to form connections with others who are </w:t>
+                  </w:r>
+                  <w:proofErr w:type="gramStart"/>
+                  <w:r>
+                    <w:rPr>
+                      <w:rFonts w:asciiTheme="minorHAnsi" w:eastAsia="Times New Roman" w:hAnsiTheme="minorHAnsi" w:cstheme="minorHAnsi"/>
+                      <w:sz w:val="28"/>
+                      <w:szCs w:val="28"/>
+                      <w:lang w:val="en-IN" w:eastAsia="en-IN"/>
+                    </w:rPr>
+                    <w:t>similar to</w:t>
+                  </w:r>
+                  <w:proofErr w:type="gramEnd"/>
+                  <w:r>
+                    <w:rPr>
+                      <w:rFonts w:asciiTheme="minorHAnsi" w:eastAsia="Times New Roman" w:hAnsiTheme="minorHAnsi" w:cstheme="minorHAnsi"/>
+                      <w:sz w:val="28"/>
+                      <w:szCs w:val="28"/>
+                      <w:lang w:val="en-IN" w:eastAsia="en-IN"/>
+                    </w:rPr>
+                    <w:t xml:space="preserve"> them</w:t>
                   </w:r>
                 </w:p>
               </w:tc>
@@ -5293,7 +5369,25 @@
                 <w:sz w:val="28"/>
                 <w:szCs w:val="28"/>
               </w:rPr>
-              <w:t>Selection is often driven by homophily, the tendency for individuals to connect with others who are similar to themselves. Homophily can be based on a variety of factors, including demographic characteristics, interests, and attitudes. The selection process can lead to the formation of social clusters or communities, where individuals are more closely connected to others within their community than to those outside of it.</w:t>
+              <w:t xml:space="preserve">Selection is often driven by homophily, the tendency for individuals to connect with others who are </w:t>
+            </w:r>
+            <w:proofErr w:type="gramStart"/>
+            <w:r>
+              <w:rPr>
+                <w:rFonts w:asciiTheme="minorHAnsi" w:hAnsiTheme="minorHAnsi" w:cstheme="minorHAnsi"/>
+                <w:sz w:val="28"/>
+                <w:szCs w:val="28"/>
+              </w:rPr>
+              <w:t>similar to</w:t>
+            </w:r>
+            <w:proofErr w:type="gramEnd"/>
+            <w:r>
+              <w:rPr>
+                <w:rFonts w:asciiTheme="minorHAnsi" w:hAnsiTheme="minorHAnsi" w:cstheme="minorHAnsi"/>
+                <w:sz w:val="28"/>
+                <w:szCs w:val="28"/>
+              </w:rPr>
+              <w:t xml:space="preserve"> themselves. Homophily can be based on a variety of factors, including demographic characteristics, interests, and attitudes. The selection process can lead to the formation of social clusters or communities, where individuals are more closely connected to others within their community than to those outside of it.</w:t>
             </w:r>
           </w:p>
           <w:p>
@@ -5383,7 +5477,25 @@
                 <w:sz w:val="28"/>
                 <w:szCs w:val="28"/>
               </w:rPr>
-              <w:t>Understanding the interplay between selection and social influence is crucial for understanding how social networks shape individual and collective behavior. By analyzing the patterns of connections in a network, researchers can identify the mechanisms of selection and social influence at play, and can use this information to develop strategies for promoting positive behaviors and attitudes, and for mitigating negative ones.</w:t>
+              <w:t xml:space="preserve">Understanding the interplay between selection and social influence is crucial for understanding how social networks shape individual and collective behavior. By analyzing the patterns of connections in a network, researchers can identify the mechanisms of selection and social influence at </w:t>
+            </w:r>
+            <w:proofErr w:type="gramStart"/>
+            <w:r>
+              <w:rPr>
+                <w:rFonts w:asciiTheme="minorHAnsi" w:hAnsiTheme="minorHAnsi" w:cstheme="minorHAnsi"/>
+                <w:sz w:val="28"/>
+                <w:szCs w:val="28"/>
+              </w:rPr>
+              <w:t>play, and</w:t>
+            </w:r>
+            <w:proofErr w:type="gramEnd"/>
+            <w:r>
+              <w:rPr>
+                <w:rFonts w:asciiTheme="minorHAnsi" w:hAnsiTheme="minorHAnsi" w:cstheme="minorHAnsi"/>
+                <w:sz w:val="28"/>
+                <w:szCs w:val="28"/>
+              </w:rPr>
+              <w:t xml:space="preserve"> can use this information to develop strategies for promoting positive behaviors and attitudes, and for mitigating negative ones.</w:t>
             </w:r>
           </w:p>
           <w:p>
@@ -5999,7 +6111,25 @@
                 <w:sz w:val="28"/>
                 <w:szCs w:val="28"/>
               </w:rPr>
-              <w:t>The basic idea of the Schelling model is that individuals have a preference for living in a neighborhood where a certain proportion of their neighbors are similar to them. For example, a person might prefer to live in a neighborhood where at least 30% of their neighbors are of the same race or ethnicity. If this preference is not met, the individual may choose to move to a different neighborhood.</w:t>
+              <w:t xml:space="preserve">The basic idea of the Schelling model is that individuals </w:t>
+            </w:r>
+            <w:proofErr w:type="gramStart"/>
+            <w:r>
+              <w:rPr>
+                <w:rFonts w:asciiTheme="minorHAnsi" w:hAnsiTheme="minorHAnsi" w:cstheme="minorHAnsi"/>
+                <w:sz w:val="28"/>
+                <w:szCs w:val="28"/>
+              </w:rPr>
+              <w:t>have a preference for</w:t>
+            </w:r>
+            <w:proofErr w:type="gramEnd"/>
+            <w:r>
+              <w:rPr>
+                <w:rFonts w:asciiTheme="minorHAnsi" w:hAnsiTheme="minorHAnsi" w:cstheme="minorHAnsi"/>
+                <w:sz w:val="28"/>
+                <w:szCs w:val="28"/>
+              </w:rPr>
+              <w:t xml:space="preserve"> living in a neighborhood where a certain proportion of their neighbors are similar to them. For example, a person might prefer to live in a neighborhood where at least 30% of their neighbors are of the same race or ethnicity. If this preference is not met, the individual may choose to move to a different neighborhood.</w:t>
             </w:r>
           </w:p>
           <w:p>
@@ -6247,7 +6377,29 @@
                 <w:sz w:val="28"/>
                 <w:szCs w:val="28"/>
               </w:rPr>
-              <w:t>Write a note on : Diffusion in Network</w:t>
+              <w:t xml:space="preserve">Write a note </w:t>
+            </w:r>
+            <w:proofErr w:type="gramStart"/>
+            <w:r>
+              <w:rPr>
+                <w:rFonts w:asciiTheme="minorHAnsi" w:hAnsiTheme="minorHAnsi" w:cstheme="minorHAnsi"/>
+                <w:b/>
+                <w:bCs/>
+                <w:sz w:val="28"/>
+                <w:szCs w:val="28"/>
+              </w:rPr>
+              <w:t>on :</w:t>
+            </w:r>
+            <w:proofErr w:type="gramEnd"/>
+            <w:r>
+              <w:rPr>
+                <w:rFonts w:asciiTheme="minorHAnsi" w:hAnsiTheme="minorHAnsi" w:cstheme="minorHAnsi"/>
+                <w:b/>
+                <w:bCs/>
+                <w:sz w:val="28"/>
+                <w:szCs w:val="28"/>
+              </w:rPr>
+              <w:t xml:space="preserve"> Diffusion in Network</w:t>
             </w:r>
           </w:p>
         </w:tc>
@@ -7774,6 +7926,7 @@
                     <w:t xml:space="preserve">Flu outbreak in </w:t>
                   </w:r>
                   <w:proofErr w:type="spellStart"/>
+                  <w:proofErr w:type="gramStart"/>
                   <w:r>
                     <w:rPr>
                       <w:rFonts w:asciiTheme="minorHAnsi" w:eastAsia="Times New Roman" w:hAnsiTheme="minorHAnsi" w:cstheme="minorHAnsi"/>
@@ -7784,6 +7937,7 @@
                     <w:t>a</w:t>
                   </w:r>
                   <w:proofErr w:type="spellEnd"/>
+                  <w:proofErr w:type="gramEnd"/>
                   <w:r>
                     <w:rPr>
                       <w:rFonts w:asciiTheme="minorHAnsi" w:eastAsia="Times New Roman" w:hAnsiTheme="minorHAnsi" w:cstheme="minorHAnsi"/>
@@ -8029,6 +8183,7 @@
                 <w:szCs w:val="28"/>
               </w:rPr>
             </w:pPr>
+            <w:bookmarkStart w:id="0" w:name="_Hlk165235541"/>
             <w:r>
               <w:rPr>
                 <w:rFonts w:asciiTheme="minorHAnsi" w:hAnsiTheme="minorHAnsi" w:cstheme="minorHAnsi"/>
@@ -8652,7 +8807,27 @@
                 <w:szCs w:val="28"/>
                 <w:lang w:val="en-IN"/>
               </w:rPr>
-              <w:t xml:space="preserve"> social networks. GEXF files are composed of various XML tags and are similar to </w:t>
+              <w:t xml:space="preserve"> social networks. GEXF files are composed of various XML tags and are </w:t>
+            </w:r>
+            <w:proofErr w:type="gramStart"/>
+            <w:r>
+              <w:rPr>
+                <w:rFonts w:asciiTheme="minorHAnsi" w:hAnsiTheme="minorHAnsi" w:cstheme="minorHAnsi"/>
+                <w:sz w:val="28"/>
+                <w:szCs w:val="28"/>
+                <w:lang w:val="en-IN"/>
+              </w:rPr>
+              <w:t>similar to</w:t>
+            </w:r>
+            <w:proofErr w:type="gramEnd"/>
+            <w:r>
+              <w:rPr>
+                <w:rFonts w:asciiTheme="minorHAnsi" w:hAnsiTheme="minorHAnsi" w:cstheme="minorHAnsi"/>
+                <w:sz w:val="28"/>
+                <w:szCs w:val="28"/>
+                <w:lang w:val="en-IN"/>
+              </w:rPr>
+              <w:t xml:space="preserve"> </w:t>
             </w:r>
             <w:proofErr w:type="spellStart"/>
             <w:r>
@@ -8704,6 +8879,1289 @@
                 <w:lang w:val="en-IN"/>
               </w:rPr>
               <w:t>These formats are widely used for storing and sharing network data, and each has its strengths and weaknesses. The choice of format depends on the specific needs of the network analysis task at hand.</w:t>
+            </w:r>
+          </w:p>
+        </w:tc>
+      </w:tr>
+      <w:bookmarkEnd w:id="0"/>
+    </w:tbl>
+    <w:p>
+      <w:pPr>
+        <w:pStyle w:val="TableParagraph"/>
+        <w:ind w:left="1"/>
+        <w:jc w:val="center"/>
+        <w:rPr>
+          <w:rFonts w:asciiTheme="minorHAnsi" w:hAnsiTheme="minorHAnsi" w:cstheme="minorHAnsi"/>
+          <w:b/>
+          <w:bCs/>
+          <w:sz w:val="28"/>
+          <w:szCs w:val="28"/>
+        </w:rPr>
+        <w:sectPr>
+          <w:pgSz w:w="11913" w:h="13041"/>
+          <w:pgMar w:top="0" w:right="1480" w:bottom="0" w:left="697" w:header="720" w:footer="720" w:gutter="0"/>
+          <w:cols w:space="720"/>
+        </w:sectPr>
+      </w:pPr>
+    </w:p>
+    <w:tbl>
+      <w:tblPr>
+        <w:tblW w:w="11340" w:type="dxa"/>
+        <w:tblInd w:w="-562" w:type="dxa"/>
+        <w:tblLayout w:type="fixed"/>
+        <w:tblCellMar>
+          <w:left w:w="0" w:type="dxa"/>
+          <w:right w:w="0" w:type="dxa"/>
+        </w:tblCellMar>
+        <w:tblLook w:val="04A0" w:firstRow="1" w:lastRow="0" w:firstColumn="1" w:lastColumn="0" w:noHBand="0" w:noVBand="1"/>
+      </w:tblPr>
+      <w:tblGrid>
+        <w:gridCol w:w="993"/>
+        <w:gridCol w:w="10347"/>
+      </w:tblGrid>
+      <w:tr>
+        <w:trPr>
+          <w:trHeight w:val="20"/>
+        </w:trPr>
+        <w:tc>
+          <w:tcPr>
+            <w:tcW w:w="993" w:type="dxa"/>
+          </w:tcPr>
+          <w:p>
+            <w:pPr>
+              <w:pStyle w:val="TableParagraph"/>
+              <w:ind w:left="1"/>
+              <w:jc w:val="center"/>
+              <w:rPr>
+                <w:rFonts w:asciiTheme="minorHAnsi" w:hAnsiTheme="minorHAnsi" w:cstheme="minorHAnsi"/>
+                <w:b/>
+                <w:bCs/>
+                <w:sz w:val="28"/>
+                <w:szCs w:val="28"/>
+              </w:rPr>
+            </w:pPr>
+            <w:r>
+              <w:rPr>
+                <w:rFonts w:asciiTheme="minorHAnsi" w:hAnsiTheme="minorHAnsi" w:cstheme="minorHAnsi"/>
+                <w:b/>
+                <w:bCs/>
+                <w:sz w:val="28"/>
+                <w:szCs w:val="28"/>
+              </w:rPr>
+              <w:lastRenderedPageBreak/>
+              <w:t>12</w:t>
+            </w:r>
+          </w:p>
+        </w:tc>
+        <w:tc>
+          <w:tcPr>
+            <w:tcW w:w="10347" w:type="dxa"/>
+          </w:tcPr>
+          <w:p>
+            <w:pPr>
+              <w:pStyle w:val="TableParagraph"/>
+              <w:ind w:left="0"/>
+              <w:rPr>
+                <w:rFonts w:asciiTheme="minorHAnsi" w:hAnsiTheme="minorHAnsi" w:cstheme="minorHAnsi"/>
+                <w:b/>
+                <w:bCs/>
+                <w:sz w:val="28"/>
+                <w:szCs w:val="28"/>
+              </w:rPr>
+            </w:pPr>
+            <w:r>
+              <w:rPr>
+                <w:rFonts w:asciiTheme="minorHAnsi" w:hAnsiTheme="minorHAnsi" w:cstheme="minorHAnsi"/>
+                <w:b/>
+                <w:bCs/>
+                <w:sz w:val="28"/>
+                <w:szCs w:val="28"/>
+              </w:rPr>
+              <w:t>Illustrate Milgram’s Experiment in detail.</w:t>
+            </w:r>
+          </w:p>
+        </w:tc>
+      </w:tr>
+      <w:tr>
+        <w:trPr>
+          <w:trHeight w:val="20"/>
+        </w:trPr>
+        <w:tc>
+          <w:tcPr>
+            <w:tcW w:w="993" w:type="dxa"/>
+          </w:tcPr>
+          <w:p>
+            <w:pPr>
+              <w:pStyle w:val="TableParagraph"/>
+              <w:ind w:left="1"/>
+              <w:jc w:val="center"/>
+              <w:rPr>
+                <w:rFonts w:asciiTheme="minorHAnsi" w:hAnsiTheme="minorHAnsi" w:cstheme="minorHAnsi"/>
+                <w:b/>
+                <w:bCs/>
+                <w:sz w:val="28"/>
+                <w:szCs w:val="28"/>
+              </w:rPr>
+            </w:pPr>
+            <w:r>
+              <w:rPr>
+                <w:rFonts w:asciiTheme="minorHAnsi" w:hAnsiTheme="minorHAnsi" w:cstheme="minorHAnsi"/>
+                <w:b/>
+                <w:bCs/>
+                <w:color w:val="FF0000"/>
+                <w:sz w:val="28"/>
+                <w:szCs w:val="28"/>
+              </w:rPr>
+              <w:t>Ans.1</w:t>
+            </w:r>
+            <w:r>
+              <w:rPr>
+                <w:rFonts w:asciiTheme="minorHAnsi" w:hAnsiTheme="minorHAnsi" w:cstheme="minorHAnsi"/>
+                <w:b/>
+                <w:bCs/>
+                <w:color w:val="FF0000"/>
+                <w:sz w:val="28"/>
+                <w:szCs w:val="28"/>
+              </w:rPr>
+              <w:t>2</w:t>
+            </w:r>
+            <w:r>
+              <w:rPr>
+                <w:rFonts w:asciiTheme="minorHAnsi" w:hAnsiTheme="minorHAnsi" w:cstheme="minorHAnsi"/>
+                <w:b/>
+                <w:bCs/>
+                <w:color w:val="FF0000"/>
+                <w:sz w:val="28"/>
+                <w:szCs w:val="28"/>
+              </w:rPr>
+              <w:t>)</w:t>
+            </w:r>
+          </w:p>
+        </w:tc>
+        <w:tc>
+          <w:tcPr>
+            <w:tcW w:w="10347" w:type="dxa"/>
+          </w:tcPr>
+          <w:p>
+            <w:pPr>
+              <w:widowControl/>
+              <w:autoSpaceDE/>
+              <w:autoSpaceDN/>
+              <w:ind w:left="274"/>
+              <w:rPr>
+                <w:rFonts w:asciiTheme="minorHAnsi" w:eastAsia="Times New Roman" w:hAnsiTheme="minorHAnsi" w:cstheme="minorHAnsi"/>
+                <w:sz w:val="28"/>
+                <w:szCs w:val="28"/>
+                <w:lang w:val="en-IN" w:eastAsia="en-IN"/>
+              </w:rPr>
+            </w:pPr>
+            <w:r>
+              <w:rPr>
+                <w:rFonts w:asciiTheme="minorHAnsi" w:eastAsia="Times New Roman" w:hAnsiTheme="minorHAnsi" w:cstheme="minorHAnsi"/>
+                <w:sz w:val="28"/>
+                <w:szCs w:val="28"/>
+                <w:lang w:val="en-IN" w:eastAsia="en-IN"/>
+              </w:rPr>
+              <w:t>Milgram's experiment, also known as the "small-world experiment," was a series of social psychology experiments conducted by Stanley Milgram in the 1960s. The experiment aimed to study the concept of "six degrees of separation," which suggests that any two people in the world can be connected through a chain of acquaintances with no more than six intermediaries.</w:t>
+            </w:r>
+          </w:p>
+          <w:p>
+            <w:pPr>
+              <w:widowControl/>
+              <w:autoSpaceDE/>
+              <w:autoSpaceDN/>
+              <w:ind w:left="274"/>
+              <w:rPr>
+                <w:rFonts w:asciiTheme="minorHAnsi" w:eastAsia="Times New Roman" w:hAnsiTheme="minorHAnsi" w:cstheme="minorHAnsi"/>
+                <w:sz w:val="28"/>
+                <w:szCs w:val="28"/>
+                <w:lang w:val="en-IN" w:eastAsia="en-IN"/>
+              </w:rPr>
+            </w:pPr>
+          </w:p>
+          <w:p>
+            <w:pPr>
+              <w:widowControl/>
+              <w:autoSpaceDE/>
+              <w:autoSpaceDN/>
+              <w:ind w:left="274"/>
+              <w:rPr>
+                <w:rFonts w:asciiTheme="minorHAnsi" w:eastAsia="Times New Roman" w:hAnsiTheme="minorHAnsi" w:cstheme="minorHAnsi"/>
+                <w:sz w:val="28"/>
+                <w:szCs w:val="28"/>
+                <w:lang w:val="en-IN" w:eastAsia="en-IN"/>
+              </w:rPr>
+            </w:pPr>
+            <w:r>
+              <w:rPr>
+                <w:rFonts w:asciiTheme="minorHAnsi" w:eastAsia="Times New Roman" w:hAnsiTheme="minorHAnsi" w:cstheme="minorHAnsi"/>
+                <w:sz w:val="28"/>
+                <w:szCs w:val="28"/>
+                <w:lang w:val="en-IN" w:eastAsia="en-IN"/>
+              </w:rPr>
+              <w:t>Here's a detailed illustration of Milgram's experiment:</w:t>
+            </w:r>
+          </w:p>
+          <w:p>
+            <w:pPr>
+              <w:widowControl/>
+              <w:numPr>
+                <w:ilvl w:val="0"/>
+                <w:numId w:val="13"/>
+              </w:numPr>
+              <w:autoSpaceDE/>
+              <w:autoSpaceDN/>
+              <w:rPr>
+                <w:rFonts w:asciiTheme="minorHAnsi" w:eastAsia="Times New Roman" w:hAnsiTheme="minorHAnsi" w:cstheme="minorHAnsi"/>
+                <w:b/>
+                <w:bCs/>
+                <w:sz w:val="28"/>
+                <w:szCs w:val="28"/>
+                <w:lang w:val="en-IN" w:eastAsia="en-IN"/>
+              </w:rPr>
+            </w:pPr>
+            <w:r>
+              <w:rPr>
+                <w:rFonts w:asciiTheme="minorHAnsi" w:eastAsia="Times New Roman" w:hAnsiTheme="minorHAnsi" w:cstheme="minorHAnsi"/>
+                <w:b/>
+                <w:bCs/>
+                <w:sz w:val="28"/>
+                <w:szCs w:val="28"/>
+                <w:lang w:val="en-IN" w:eastAsia="en-IN"/>
+              </w:rPr>
+              <w:t>Participant Selection:</w:t>
+            </w:r>
+          </w:p>
+          <w:p>
+            <w:pPr>
+              <w:widowControl/>
+              <w:numPr>
+                <w:ilvl w:val="1"/>
+                <w:numId w:val="13"/>
+              </w:numPr>
+              <w:autoSpaceDE/>
+              <w:autoSpaceDN/>
+              <w:rPr>
+                <w:rFonts w:asciiTheme="minorHAnsi" w:eastAsia="Times New Roman" w:hAnsiTheme="minorHAnsi" w:cstheme="minorHAnsi"/>
+                <w:sz w:val="28"/>
+                <w:szCs w:val="28"/>
+                <w:lang w:val="en-IN" w:eastAsia="en-IN"/>
+              </w:rPr>
+            </w:pPr>
+            <w:r>
+              <w:rPr>
+                <w:rFonts w:asciiTheme="minorHAnsi" w:eastAsia="Times New Roman" w:hAnsiTheme="minorHAnsi" w:cstheme="minorHAnsi"/>
+                <w:sz w:val="28"/>
+                <w:szCs w:val="28"/>
+                <w:lang w:val="en-IN" w:eastAsia="en-IN"/>
+              </w:rPr>
+              <w:t>Milgram selected a group of people living in Omaha, Nebraska, and Wichita, Kansas, as the starting participants.</w:t>
+            </w:r>
+          </w:p>
+          <w:p>
+            <w:pPr>
+              <w:widowControl/>
+              <w:numPr>
+                <w:ilvl w:val="1"/>
+                <w:numId w:val="13"/>
+              </w:numPr>
+              <w:autoSpaceDE/>
+              <w:autoSpaceDN/>
+              <w:rPr>
+                <w:rFonts w:asciiTheme="minorHAnsi" w:eastAsia="Times New Roman" w:hAnsiTheme="minorHAnsi" w:cstheme="minorHAnsi"/>
+                <w:sz w:val="28"/>
+                <w:szCs w:val="28"/>
+                <w:lang w:val="en-IN" w:eastAsia="en-IN"/>
+              </w:rPr>
+            </w:pPr>
+            <w:r>
+              <w:rPr>
+                <w:rFonts w:asciiTheme="minorHAnsi" w:eastAsia="Times New Roman" w:hAnsiTheme="minorHAnsi" w:cstheme="minorHAnsi"/>
+                <w:sz w:val="28"/>
+                <w:szCs w:val="28"/>
+                <w:lang w:val="en-IN" w:eastAsia="en-IN"/>
+              </w:rPr>
+              <w:t>These participants were asked to try to reach a specific target person, a stockbroker living in Boston, Massachusetts.</w:t>
+            </w:r>
+          </w:p>
+          <w:p>
+            <w:pPr>
+              <w:widowControl/>
+              <w:autoSpaceDE/>
+              <w:autoSpaceDN/>
+              <w:ind w:left="1440"/>
+              <w:rPr>
+                <w:rFonts w:asciiTheme="minorHAnsi" w:eastAsia="Times New Roman" w:hAnsiTheme="minorHAnsi" w:cstheme="minorHAnsi"/>
+                <w:sz w:val="28"/>
+                <w:szCs w:val="28"/>
+                <w:lang w:val="en-IN" w:eastAsia="en-IN"/>
+              </w:rPr>
+            </w:pPr>
+          </w:p>
+          <w:p>
+            <w:pPr>
+              <w:widowControl/>
+              <w:numPr>
+                <w:ilvl w:val="0"/>
+                <w:numId w:val="13"/>
+              </w:numPr>
+              <w:autoSpaceDE/>
+              <w:autoSpaceDN/>
+              <w:rPr>
+                <w:rFonts w:asciiTheme="minorHAnsi" w:eastAsia="Times New Roman" w:hAnsiTheme="minorHAnsi" w:cstheme="minorHAnsi"/>
+                <w:b/>
+                <w:bCs/>
+                <w:sz w:val="28"/>
+                <w:szCs w:val="28"/>
+                <w:lang w:val="en-IN" w:eastAsia="en-IN"/>
+              </w:rPr>
+            </w:pPr>
+            <w:r>
+              <w:rPr>
+                <w:rFonts w:asciiTheme="minorHAnsi" w:eastAsia="Times New Roman" w:hAnsiTheme="minorHAnsi" w:cstheme="minorHAnsi"/>
+                <w:b/>
+                <w:bCs/>
+                <w:sz w:val="28"/>
+                <w:szCs w:val="28"/>
+                <w:lang w:val="en-IN" w:eastAsia="en-IN"/>
+              </w:rPr>
+              <w:t>Experimental Procedure:</w:t>
+            </w:r>
+          </w:p>
+          <w:p>
+            <w:pPr>
+              <w:widowControl/>
+              <w:numPr>
+                <w:ilvl w:val="1"/>
+                <w:numId w:val="13"/>
+              </w:numPr>
+              <w:autoSpaceDE/>
+              <w:autoSpaceDN/>
+              <w:rPr>
+                <w:rFonts w:asciiTheme="minorHAnsi" w:eastAsia="Times New Roman" w:hAnsiTheme="minorHAnsi" w:cstheme="minorHAnsi"/>
+                <w:sz w:val="28"/>
+                <w:szCs w:val="28"/>
+                <w:lang w:val="en-IN" w:eastAsia="en-IN"/>
+              </w:rPr>
+            </w:pPr>
+            <w:r>
+              <w:rPr>
+                <w:rFonts w:asciiTheme="minorHAnsi" w:eastAsia="Times New Roman" w:hAnsiTheme="minorHAnsi" w:cstheme="minorHAnsi"/>
+                <w:sz w:val="28"/>
+                <w:szCs w:val="28"/>
+                <w:lang w:val="en-IN" w:eastAsia="en-IN"/>
+              </w:rPr>
+              <w:t>Each participant was given the name and address of the target person and was instructed to send a package to that person.</w:t>
+            </w:r>
+          </w:p>
+          <w:p>
+            <w:pPr>
+              <w:widowControl/>
+              <w:numPr>
+                <w:ilvl w:val="1"/>
+                <w:numId w:val="13"/>
+              </w:numPr>
+              <w:autoSpaceDE/>
+              <w:autoSpaceDN/>
+              <w:rPr>
+                <w:rFonts w:asciiTheme="minorHAnsi" w:eastAsia="Times New Roman" w:hAnsiTheme="minorHAnsi" w:cstheme="minorHAnsi"/>
+                <w:sz w:val="28"/>
+                <w:szCs w:val="28"/>
+                <w:lang w:val="en-IN" w:eastAsia="en-IN"/>
+              </w:rPr>
+            </w:pPr>
+            <w:r>
+              <w:rPr>
+                <w:rFonts w:asciiTheme="minorHAnsi" w:eastAsia="Times New Roman" w:hAnsiTheme="minorHAnsi" w:cstheme="minorHAnsi"/>
+                <w:sz w:val="28"/>
+                <w:szCs w:val="28"/>
+                <w:lang w:val="en-IN" w:eastAsia="en-IN"/>
+              </w:rPr>
+              <w:t>However, the participants were not allowed to send the package directly to the target person. Instead, they had to send it to someone they knew on a first-name basis, who they thought might be able to reach the target person more easily.</w:t>
+            </w:r>
+          </w:p>
+          <w:p>
+            <w:pPr>
+              <w:widowControl/>
+              <w:numPr>
+                <w:ilvl w:val="1"/>
+                <w:numId w:val="13"/>
+              </w:numPr>
+              <w:autoSpaceDE/>
+              <w:autoSpaceDN/>
+              <w:rPr>
+                <w:rFonts w:asciiTheme="minorHAnsi" w:eastAsia="Times New Roman" w:hAnsiTheme="minorHAnsi" w:cstheme="minorHAnsi"/>
+                <w:sz w:val="28"/>
+                <w:szCs w:val="28"/>
+                <w:lang w:val="en-IN" w:eastAsia="en-IN"/>
+              </w:rPr>
+            </w:pPr>
+            <w:r>
+              <w:rPr>
+                <w:rFonts w:asciiTheme="minorHAnsi" w:eastAsia="Times New Roman" w:hAnsiTheme="minorHAnsi" w:cstheme="minorHAnsi"/>
+                <w:sz w:val="28"/>
+                <w:szCs w:val="28"/>
+                <w:lang w:val="en-IN" w:eastAsia="en-IN"/>
+              </w:rPr>
+              <w:t>The participants were asked to keep track of the chain of people through whom the package was passed.</w:t>
+            </w:r>
+          </w:p>
+          <w:p>
+            <w:pPr>
+              <w:widowControl/>
+              <w:autoSpaceDE/>
+              <w:autoSpaceDN/>
+              <w:ind w:left="1440"/>
+              <w:rPr>
+                <w:rFonts w:asciiTheme="minorHAnsi" w:eastAsia="Times New Roman" w:hAnsiTheme="minorHAnsi" w:cstheme="minorHAnsi"/>
+                <w:sz w:val="28"/>
+                <w:szCs w:val="28"/>
+                <w:lang w:val="en-IN" w:eastAsia="en-IN"/>
+              </w:rPr>
+            </w:pPr>
+          </w:p>
+          <w:p>
+            <w:pPr>
+              <w:widowControl/>
+              <w:numPr>
+                <w:ilvl w:val="0"/>
+                <w:numId w:val="13"/>
+              </w:numPr>
+              <w:autoSpaceDE/>
+              <w:autoSpaceDN/>
+              <w:rPr>
+                <w:rFonts w:asciiTheme="minorHAnsi" w:eastAsia="Times New Roman" w:hAnsiTheme="minorHAnsi" w:cstheme="minorHAnsi"/>
+                <w:b/>
+                <w:bCs/>
+                <w:sz w:val="28"/>
+                <w:szCs w:val="28"/>
+                <w:lang w:val="en-IN" w:eastAsia="en-IN"/>
+              </w:rPr>
+            </w:pPr>
+            <w:r>
+              <w:rPr>
+                <w:rFonts w:asciiTheme="minorHAnsi" w:eastAsia="Times New Roman" w:hAnsiTheme="minorHAnsi" w:cstheme="minorHAnsi"/>
+                <w:b/>
+                <w:bCs/>
+                <w:sz w:val="28"/>
+                <w:szCs w:val="28"/>
+                <w:lang w:val="en-IN" w:eastAsia="en-IN"/>
+              </w:rPr>
+              <w:t>Chain of Acquaintances:</w:t>
+            </w:r>
+          </w:p>
+          <w:p>
+            <w:pPr>
+              <w:widowControl/>
+              <w:numPr>
+                <w:ilvl w:val="1"/>
+                <w:numId w:val="13"/>
+              </w:numPr>
+              <w:autoSpaceDE/>
+              <w:autoSpaceDN/>
+              <w:rPr>
+                <w:rFonts w:asciiTheme="minorHAnsi" w:eastAsia="Times New Roman" w:hAnsiTheme="minorHAnsi" w:cstheme="minorHAnsi"/>
+                <w:sz w:val="28"/>
+                <w:szCs w:val="28"/>
+                <w:lang w:val="en-IN" w:eastAsia="en-IN"/>
+              </w:rPr>
+            </w:pPr>
+            <w:r>
+              <w:rPr>
+                <w:rFonts w:asciiTheme="minorHAnsi" w:eastAsia="Times New Roman" w:hAnsiTheme="minorHAnsi" w:cstheme="minorHAnsi"/>
+                <w:sz w:val="28"/>
+                <w:szCs w:val="28"/>
+                <w:lang w:val="en-IN" w:eastAsia="en-IN"/>
+              </w:rPr>
+              <w:t>When the participant received the package, they would write down their name and the name of the person they were sending it to, and then forward the package to that person.</w:t>
+            </w:r>
+          </w:p>
+          <w:p>
+            <w:pPr>
+              <w:widowControl/>
+              <w:numPr>
+                <w:ilvl w:val="1"/>
+                <w:numId w:val="13"/>
+              </w:numPr>
+              <w:autoSpaceDE/>
+              <w:autoSpaceDN/>
+              <w:rPr>
+                <w:rFonts w:asciiTheme="minorHAnsi" w:eastAsia="Times New Roman" w:hAnsiTheme="minorHAnsi" w:cstheme="minorHAnsi"/>
+                <w:sz w:val="28"/>
+                <w:szCs w:val="28"/>
+                <w:lang w:val="en-IN" w:eastAsia="en-IN"/>
+              </w:rPr>
+            </w:pPr>
+            <w:r>
+              <w:rPr>
+                <w:rFonts w:asciiTheme="minorHAnsi" w:eastAsia="Times New Roman" w:hAnsiTheme="minorHAnsi" w:cstheme="minorHAnsi"/>
+                <w:sz w:val="28"/>
+                <w:szCs w:val="28"/>
+                <w:lang w:val="en-IN" w:eastAsia="en-IN"/>
+              </w:rPr>
+              <w:t>The person receiving the package would repeat the process, continuing the chain of acquaintances until the package reached the target person.</w:t>
+            </w:r>
+          </w:p>
+          <w:p>
+            <w:pPr>
+              <w:widowControl/>
+              <w:autoSpaceDE/>
+              <w:autoSpaceDN/>
+              <w:ind w:left="1440"/>
+              <w:rPr>
+                <w:rFonts w:asciiTheme="minorHAnsi" w:eastAsia="Times New Roman" w:hAnsiTheme="minorHAnsi" w:cstheme="minorHAnsi"/>
+                <w:sz w:val="28"/>
+                <w:szCs w:val="28"/>
+                <w:lang w:val="en-IN" w:eastAsia="en-IN"/>
+              </w:rPr>
+            </w:pPr>
+          </w:p>
+          <w:p>
+            <w:pPr>
+              <w:widowControl/>
+              <w:numPr>
+                <w:ilvl w:val="0"/>
+                <w:numId w:val="13"/>
+              </w:numPr>
+              <w:autoSpaceDE/>
+              <w:autoSpaceDN/>
+              <w:rPr>
+                <w:rFonts w:asciiTheme="minorHAnsi" w:eastAsia="Times New Roman" w:hAnsiTheme="minorHAnsi" w:cstheme="minorHAnsi"/>
+                <w:b/>
+                <w:bCs/>
+                <w:sz w:val="28"/>
+                <w:szCs w:val="28"/>
+                <w:lang w:val="en-IN" w:eastAsia="en-IN"/>
+              </w:rPr>
+            </w:pPr>
+            <w:r>
+              <w:rPr>
+                <w:rFonts w:asciiTheme="minorHAnsi" w:eastAsia="Times New Roman" w:hAnsiTheme="minorHAnsi" w:cstheme="minorHAnsi"/>
+                <w:b/>
+                <w:bCs/>
+                <w:sz w:val="28"/>
+                <w:szCs w:val="28"/>
+                <w:lang w:val="en-IN" w:eastAsia="en-IN"/>
+              </w:rPr>
+              <w:t>Measuring the Chain Length:</w:t>
+            </w:r>
+          </w:p>
+          <w:p>
+            <w:pPr>
+              <w:widowControl/>
+              <w:numPr>
+                <w:ilvl w:val="1"/>
+                <w:numId w:val="13"/>
+              </w:numPr>
+              <w:autoSpaceDE/>
+              <w:autoSpaceDN/>
+              <w:rPr>
+                <w:rFonts w:asciiTheme="minorHAnsi" w:eastAsia="Times New Roman" w:hAnsiTheme="minorHAnsi" w:cstheme="minorHAnsi"/>
+                <w:sz w:val="28"/>
+                <w:szCs w:val="28"/>
+                <w:lang w:val="en-IN" w:eastAsia="en-IN"/>
+              </w:rPr>
+            </w:pPr>
+            <w:r>
+              <w:rPr>
+                <w:rFonts w:asciiTheme="minorHAnsi" w:eastAsia="Times New Roman" w:hAnsiTheme="minorHAnsi" w:cstheme="minorHAnsi"/>
+                <w:sz w:val="28"/>
+                <w:szCs w:val="28"/>
+                <w:lang w:val="en-IN" w:eastAsia="en-IN"/>
+              </w:rPr>
+              <w:t xml:space="preserve">Milgram </w:t>
+            </w:r>
+            <w:proofErr w:type="spellStart"/>
+            <w:r>
+              <w:rPr>
+                <w:rFonts w:asciiTheme="minorHAnsi" w:eastAsia="Times New Roman" w:hAnsiTheme="minorHAnsi" w:cstheme="minorHAnsi"/>
+                <w:sz w:val="28"/>
+                <w:szCs w:val="28"/>
+                <w:lang w:val="en-IN" w:eastAsia="en-IN"/>
+              </w:rPr>
+              <w:t>analyzed</w:t>
+            </w:r>
+            <w:proofErr w:type="spellEnd"/>
+            <w:r>
+              <w:rPr>
+                <w:rFonts w:asciiTheme="minorHAnsi" w:eastAsia="Times New Roman" w:hAnsiTheme="minorHAnsi" w:cstheme="minorHAnsi"/>
+                <w:sz w:val="28"/>
+                <w:szCs w:val="28"/>
+                <w:lang w:val="en-IN" w:eastAsia="en-IN"/>
+              </w:rPr>
+              <w:t xml:space="preserve"> the chains of acquaintances that were formed to reach the target person.</w:t>
+            </w:r>
+          </w:p>
+          <w:p>
+            <w:pPr>
+              <w:widowControl/>
+              <w:numPr>
+                <w:ilvl w:val="1"/>
+                <w:numId w:val="13"/>
+              </w:numPr>
+              <w:autoSpaceDE/>
+              <w:autoSpaceDN/>
+              <w:rPr>
+                <w:rFonts w:asciiTheme="minorHAnsi" w:eastAsia="Times New Roman" w:hAnsiTheme="minorHAnsi" w:cstheme="minorHAnsi"/>
+                <w:sz w:val="28"/>
+                <w:szCs w:val="28"/>
+                <w:lang w:val="en-IN" w:eastAsia="en-IN"/>
+              </w:rPr>
+            </w:pPr>
+            <w:r>
+              <w:rPr>
+                <w:rFonts w:asciiTheme="minorHAnsi" w:eastAsia="Times New Roman" w:hAnsiTheme="minorHAnsi" w:cstheme="minorHAnsi"/>
+                <w:sz w:val="28"/>
+                <w:szCs w:val="28"/>
+                <w:lang w:val="en-IN" w:eastAsia="en-IN"/>
+              </w:rPr>
+              <w:t>He found that the average length of the chains was around six intermediaries, which led to the concept of "six degrees of separation."</w:t>
+            </w:r>
+          </w:p>
+          <w:p>
+            <w:pPr>
+              <w:widowControl/>
+              <w:autoSpaceDE/>
+              <w:autoSpaceDN/>
+              <w:ind w:left="1440"/>
+              <w:rPr>
+                <w:rFonts w:asciiTheme="minorHAnsi" w:eastAsia="Times New Roman" w:hAnsiTheme="minorHAnsi" w:cstheme="minorHAnsi"/>
+                <w:sz w:val="28"/>
+                <w:szCs w:val="28"/>
+                <w:lang w:val="en-IN" w:eastAsia="en-IN"/>
+              </w:rPr>
+            </w:pPr>
+          </w:p>
+          <w:p>
+            <w:pPr>
+              <w:widowControl/>
+              <w:numPr>
+                <w:ilvl w:val="0"/>
+                <w:numId w:val="13"/>
+              </w:numPr>
+              <w:autoSpaceDE/>
+              <w:autoSpaceDN/>
+              <w:rPr>
+                <w:rFonts w:asciiTheme="minorHAnsi" w:eastAsia="Times New Roman" w:hAnsiTheme="minorHAnsi" w:cstheme="minorHAnsi"/>
+                <w:b/>
+                <w:bCs/>
+                <w:sz w:val="28"/>
+                <w:szCs w:val="28"/>
+                <w:lang w:val="en-IN" w:eastAsia="en-IN"/>
+              </w:rPr>
+            </w:pPr>
+            <w:r>
+              <w:rPr>
+                <w:rFonts w:asciiTheme="minorHAnsi" w:eastAsia="Times New Roman" w:hAnsiTheme="minorHAnsi" w:cstheme="minorHAnsi"/>
+                <w:b/>
+                <w:bCs/>
+                <w:sz w:val="28"/>
+                <w:szCs w:val="28"/>
+                <w:lang w:val="en-IN" w:eastAsia="en-IN"/>
+              </w:rPr>
+              <w:t>Implications:</w:t>
+            </w:r>
+          </w:p>
+          <w:p>
+            <w:pPr>
+              <w:widowControl/>
+              <w:numPr>
+                <w:ilvl w:val="1"/>
+                <w:numId w:val="13"/>
+              </w:numPr>
+              <w:autoSpaceDE/>
+              <w:autoSpaceDN/>
+              <w:rPr>
+                <w:rFonts w:asciiTheme="minorHAnsi" w:eastAsia="Times New Roman" w:hAnsiTheme="minorHAnsi" w:cstheme="minorHAnsi"/>
+                <w:sz w:val="28"/>
+                <w:szCs w:val="28"/>
+                <w:lang w:val="en-IN" w:eastAsia="en-IN"/>
+              </w:rPr>
+            </w:pPr>
+            <w:r>
+              <w:rPr>
+                <w:rFonts w:asciiTheme="minorHAnsi" w:eastAsia="Times New Roman" w:hAnsiTheme="minorHAnsi" w:cstheme="minorHAnsi"/>
+                <w:sz w:val="28"/>
+                <w:szCs w:val="28"/>
+                <w:lang w:val="en-IN" w:eastAsia="en-IN"/>
+              </w:rPr>
+              <w:t>Milgram's experiment demonstrated the surprising interconnectedness of people in social networks, even across large geographical distances.</w:t>
+            </w:r>
+          </w:p>
+          <w:p>
+            <w:pPr>
+              <w:widowControl/>
+              <w:numPr>
+                <w:ilvl w:val="1"/>
+                <w:numId w:val="13"/>
+              </w:numPr>
+              <w:autoSpaceDE/>
+              <w:autoSpaceDN/>
+              <w:rPr>
+                <w:rFonts w:asciiTheme="minorHAnsi" w:eastAsia="Times New Roman" w:hAnsiTheme="minorHAnsi" w:cstheme="minorHAnsi"/>
+                <w:sz w:val="28"/>
+                <w:szCs w:val="28"/>
+                <w:lang w:val="en-IN" w:eastAsia="en-IN"/>
+              </w:rPr>
+            </w:pPr>
+            <w:r>
+              <w:rPr>
+                <w:rFonts w:asciiTheme="minorHAnsi" w:eastAsia="Times New Roman" w:hAnsiTheme="minorHAnsi" w:cstheme="minorHAnsi"/>
+                <w:sz w:val="28"/>
+                <w:szCs w:val="28"/>
+                <w:lang w:val="en-IN" w:eastAsia="en-IN"/>
+              </w:rPr>
+              <w:t>It highlighted the power of weak ties, where individuals can reach distant targets through a chain of acquaintances, rather than relying solely on strong personal relationships.</w:t>
+            </w:r>
+          </w:p>
+          <w:p>
+            <w:pPr>
+              <w:widowControl/>
+              <w:numPr>
+                <w:ilvl w:val="1"/>
+                <w:numId w:val="13"/>
+              </w:numPr>
+              <w:autoSpaceDE/>
+              <w:autoSpaceDN/>
+              <w:rPr>
+                <w:rFonts w:asciiTheme="minorHAnsi" w:eastAsia="Times New Roman" w:hAnsiTheme="minorHAnsi" w:cstheme="minorHAnsi"/>
+                <w:sz w:val="28"/>
+                <w:szCs w:val="28"/>
+                <w:lang w:val="en-IN" w:eastAsia="en-IN"/>
+              </w:rPr>
+            </w:pPr>
+            <w:r>
+              <w:rPr>
+                <w:rFonts w:asciiTheme="minorHAnsi" w:eastAsia="Times New Roman" w:hAnsiTheme="minorHAnsi" w:cstheme="minorHAnsi"/>
+                <w:sz w:val="28"/>
+                <w:szCs w:val="28"/>
+                <w:lang w:val="en-IN" w:eastAsia="en-IN"/>
+              </w:rPr>
+              <w:t>The experiment has had a significant impact on the understanding of social networks and the dynamics of information and influence propagation within them.</w:t>
+            </w:r>
+          </w:p>
+          <w:p>
+            <w:pPr>
+              <w:widowControl/>
+              <w:autoSpaceDE/>
+              <w:autoSpaceDN/>
+              <w:ind w:left="1440"/>
+              <w:rPr>
+                <w:rFonts w:asciiTheme="minorHAnsi" w:eastAsia="Times New Roman" w:hAnsiTheme="minorHAnsi" w:cstheme="minorHAnsi"/>
+                <w:sz w:val="28"/>
+                <w:szCs w:val="28"/>
+                <w:lang w:val="en-IN" w:eastAsia="en-IN"/>
+              </w:rPr>
+            </w:pPr>
+          </w:p>
+          <w:p>
+            <w:pPr>
+              <w:widowControl/>
+              <w:autoSpaceDE/>
+              <w:autoSpaceDN/>
+              <w:ind w:left="274"/>
+              <w:rPr>
+                <w:rFonts w:asciiTheme="minorHAnsi" w:eastAsia="Times New Roman" w:hAnsiTheme="minorHAnsi" w:cstheme="minorHAnsi"/>
+                <w:sz w:val="28"/>
+                <w:szCs w:val="28"/>
+                <w:lang w:val="en-IN" w:eastAsia="en-IN"/>
+              </w:rPr>
+            </w:pPr>
+            <w:r>
+              <w:rPr>
+                <w:rFonts w:asciiTheme="minorHAnsi" w:eastAsia="Times New Roman" w:hAnsiTheme="minorHAnsi" w:cstheme="minorHAnsi"/>
+                <w:sz w:val="28"/>
+                <w:szCs w:val="28"/>
+                <w:lang w:val="en-IN" w:eastAsia="en-IN"/>
+              </w:rPr>
+              <w:t>Milgram's experiment has been replicated and expanded upon in various forms, including online social networks, and has continued to provide insights into the structure and dynamics of social connections.</w:t>
+            </w:r>
+          </w:p>
+        </w:tc>
+      </w:tr>
+    </w:tbl>
+    <w:p>
+      <w:pPr>
+        <w:pStyle w:val="TableParagraph"/>
+        <w:ind w:left="1"/>
+        <w:jc w:val="center"/>
+        <w:rPr>
+          <w:rFonts w:asciiTheme="minorHAnsi" w:hAnsiTheme="minorHAnsi" w:cstheme="minorHAnsi"/>
+          <w:b/>
+          <w:bCs/>
+          <w:sz w:val="28"/>
+          <w:szCs w:val="28"/>
+        </w:rPr>
+        <w:sectPr>
+          <w:pgSz w:w="11913" w:h="17577"/>
+          <w:pgMar w:top="0" w:right="1480" w:bottom="0" w:left="697" w:header="720" w:footer="720" w:gutter="0"/>
+          <w:cols w:space="720"/>
+        </w:sectPr>
+      </w:pPr>
+    </w:p>
+    <w:tbl>
+      <w:tblPr>
+        <w:tblW w:w="11340" w:type="dxa"/>
+        <w:tblInd w:w="-562" w:type="dxa"/>
+        <w:tblLayout w:type="fixed"/>
+        <w:tblCellMar>
+          <w:left w:w="0" w:type="dxa"/>
+          <w:right w:w="0" w:type="dxa"/>
+        </w:tblCellMar>
+        <w:tblLook w:val="04A0" w:firstRow="1" w:lastRow="0" w:firstColumn="1" w:lastColumn="0" w:noHBand="0" w:noVBand="1"/>
+      </w:tblPr>
+      <w:tblGrid>
+        <w:gridCol w:w="993"/>
+        <w:gridCol w:w="10347"/>
+      </w:tblGrid>
+      <w:tr>
+        <w:trPr>
+          <w:trHeight w:val="20"/>
+        </w:trPr>
+        <w:tc>
+          <w:tcPr>
+            <w:tcW w:w="993" w:type="dxa"/>
+          </w:tcPr>
+          <w:p>
+            <w:pPr>
+              <w:pStyle w:val="TableParagraph"/>
+              <w:ind w:left="1"/>
+              <w:jc w:val="center"/>
+              <w:rPr>
+                <w:rFonts w:asciiTheme="minorHAnsi" w:hAnsiTheme="minorHAnsi" w:cstheme="minorHAnsi"/>
+                <w:b/>
+                <w:bCs/>
+                <w:sz w:val="28"/>
+                <w:szCs w:val="28"/>
+              </w:rPr>
+            </w:pPr>
+            <w:r>
+              <w:rPr>
+                <w:rFonts w:asciiTheme="minorHAnsi" w:hAnsiTheme="minorHAnsi" w:cstheme="minorHAnsi"/>
+                <w:b/>
+                <w:bCs/>
+                <w:sz w:val="28"/>
+                <w:szCs w:val="28"/>
+              </w:rPr>
+              <w:lastRenderedPageBreak/>
+              <w:t>13</w:t>
+            </w:r>
+          </w:p>
+        </w:tc>
+        <w:tc>
+          <w:tcPr>
+            <w:tcW w:w="10347" w:type="dxa"/>
+          </w:tcPr>
+          <w:p>
+            <w:pPr>
+              <w:pStyle w:val="TableParagraph"/>
+              <w:ind w:left="0"/>
+              <w:rPr>
+                <w:rFonts w:asciiTheme="minorHAnsi" w:hAnsiTheme="minorHAnsi" w:cstheme="minorHAnsi"/>
+                <w:b/>
+                <w:bCs/>
+                <w:sz w:val="28"/>
+                <w:szCs w:val="28"/>
+              </w:rPr>
+            </w:pPr>
+            <w:r>
+              <w:rPr>
+                <w:rFonts w:asciiTheme="minorHAnsi" w:hAnsiTheme="minorHAnsi" w:cstheme="minorHAnsi"/>
+                <w:b/>
+                <w:bCs/>
+                <w:sz w:val="28"/>
+                <w:szCs w:val="28"/>
+              </w:rPr>
+              <w:t>Describe Decentralized search in Small World Effect.</w:t>
+            </w:r>
+          </w:p>
+        </w:tc>
+      </w:tr>
+      <w:tr>
+        <w:trPr>
+          <w:trHeight w:val="20"/>
+        </w:trPr>
+        <w:tc>
+          <w:tcPr>
+            <w:tcW w:w="993" w:type="dxa"/>
+          </w:tcPr>
+          <w:p>
+            <w:pPr>
+              <w:pStyle w:val="TableParagraph"/>
+              <w:ind w:left="1"/>
+              <w:jc w:val="center"/>
+              <w:rPr>
+                <w:rFonts w:asciiTheme="minorHAnsi" w:hAnsiTheme="minorHAnsi" w:cstheme="minorHAnsi"/>
+                <w:b/>
+                <w:bCs/>
+                <w:sz w:val="28"/>
+                <w:szCs w:val="28"/>
+              </w:rPr>
+            </w:pPr>
+            <w:r>
+              <w:rPr>
+                <w:rFonts w:asciiTheme="minorHAnsi" w:hAnsiTheme="minorHAnsi" w:cstheme="minorHAnsi"/>
+                <w:b/>
+                <w:bCs/>
+                <w:color w:val="FF0000"/>
+                <w:sz w:val="28"/>
+                <w:szCs w:val="28"/>
+              </w:rPr>
+              <w:t>Ans.1</w:t>
+            </w:r>
+            <w:r>
+              <w:rPr>
+                <w:rFonts w:asciiTheme="minorHAnsi" w:hAnsiTheme="minorHAnsi" w:cstheme="minorHAnsi"/>
+                <w:b/>
+                <w:bCs/>
+                <w:color w:val="FF0000"/>
+                <w:sz w:val="28"/>
+                <w:szCs w:val="28"/>
+              </w:rPr>
+              <w:t>3</w:t>
+            </w:r>
+            <w:r>
+              <w:rPr>
+                <w:rFonts w:asciiTheme="minorHAnsi" w:hAnsiTheme="minorHAnsi" w:cstheme="minorHAnsi"/>
+                <w:b/>
+                <w:bCs/>
+                <w:color w:val="FF0000"/>
+                <w:sz w:val="28"/>
+                <w:szCs w:val="28"/>
+              </w:rPr>
+              <w:t>)</w:t>
+            </w:r>
+          </w:p>
+        </w:tc>
+        <w:tc>
+          <w:tcPr>
+            <w:tcW w:w="10347" w:type="dxa"/>
+          </w:tcPr>
+          <w:p>
+            <w:pPr>
+              <w:pStyle w:val="TableParagraph"/>
+              <w:rPr>
+                <w:rFonts w:asciiTheme="minorHAnsi" w:hAnsiTheme="minorHAnsi" w:cstheme="minorHAnsi"/>
+                <w:sz w:val="28"/>
+                <w:szCs w:val="28"/>
+              </w:rPr>
+            </w:pPr>
+            <w:r>
+              <w:rPr>
+                <w:rFonts w:asciiTheme="minorHAnsi" w:hAnsiTheme="minorHAnsi" w:cstheme="minorHAnsi"/>
+                <w:sz w:val="28"/>
+                <w:szCs w:val="28"/>
+              </w:rPr>
+              <w:t>Decentralized search in the context of the Small World Effect refers to the process of finding a target node in a network without relying on a centralized search mechanism. In a decentralized search, each node in the network acts autonomously to locate the target node by leveraging local information and interactions with neighboring nodes.</w:t>
+            </w:r>
+          </w:p>
+          <w:p>
+            <w:pPr>
+              <w:pStyle w:val="TableParagraph"/>
+              <w:rPr>
+                <w:rFonts w:asciiTheme="minorHAnsi" w:hAnsiTheme="minorHAnsi" w:cstheme="minorHAnsi"/>
+                <w:sz w:val="28"/>
+                <w:szCs w:val="28"/>
+              </w:rPr>
+            </w:pPr>
+          </w:p>
+          <w:p>
+            <w:pPr>
+              <w:pStyle w:val="TableParagraph"/>
+              <w:rPr>
+                <w:rFonts w:asciiTheme="minorHAnsi" w:hAnsiTheme="minorHAnsi" w:cstheme="minorHAnsi"/>
+                <w:sz w:val="28"/>
+                <w:szCs w:val="28"/>
+              </w:rPr>
+            </w:pPr>
+            <w:r>
+              <w:rPr>
+                <w:rFonts w:asciiTheme="minorHAnsi" w:hAnsiTheme="minorHAnsi" w:cstheme="minorHAnsi"/>
+                <w:sz w:val="28"/>
+                <w:szCs w:val="28"/>
+              </w:rPr>
+              <w:t>Here is a detailed description of decentralized search in the Small World Effect:</w:t>
+            </w:r>
+          </w:p>
+          <w:p>
+            <w:pPr>
+              <w:pStyle w:val="TableParagraph"/>
+              <w:numPr>
+                <w:ilvl w:val="0"/>
+                <w:numId w:val="12"/>
+              </w:numPr>
+              <w:ind w:left="561"/>
+              <w:rPr>
+                <w:rFonts w:asciiTheme="minorHAnsi" w:hAnsiTheme="minorHAnsi" w:cstheme="minorHAnsi"/>
+                <w:sz w:val="28"/>
+                <w:szCs w:val="28"/>
+              </w:rPr>
+            </w:pPr>
+            <w:r>
+              <w:rPr>
+                <w:rFonts w:asciiTheme="minorHAnsi" w:hAnsiTheme="minorHAnsi" w:cstheme="minorHAnsi"/>
+                <w:b/>
+                <w:bCs/>
+                <w:sz w:val="28"/>
+                <w:szCs w:val="28"/>
+              </w:rPr>
+              <w:t>Autonomous Search:</w:t>
+            </w:r>
+            <w:r>
+              <w:rPr>
+                <w:rFonts w:asciiTheme="minorHAnsi" w:hAnsiTheme="minorHAnsi" w:cstheme="minorHAnsi"/>
+                <w:sz w:val="28"/>
+                <w:szCs w:val="28"/>
+              </w:rPr>
+              <w:t xml:space="preserve"> In a decentralized search, each node in the network operates independently and makes decisions based on its local knowledge. Nodes do not have access to global information about the network structure but rely on local interactions to navigate towards the target node.</w:t>
+            </w:r>
+          </w:p>
+          <w:p>
+            <w:pPr>
+              <w:pStyle w:val="TableParagraph"/>
+              <w:ind w:left="-159"/>
+              <w:rPr>
+                <w:rFonts w:asciiTheme="minorHAnsi" w:hAnsiTheme="minorHAnsi" w:cstheme="minorHAnsi"/>
+                <w:sz w:val="28"/>
+                <w:szCs w:val="28"/>
+              </w:rPr>
+            </w:pPr>
+          </w:p>
+          <w:p>
+            <w:pPr>
+              <w:pStyle w:val="TableParagraph"/>
+              <w:numPr>
+                <w:ilvl w:val="0"/>
+                <w:numId w:val="12"/>
+              </w:numPr>
+              <w:ind w:left="561"/>
+              <w:rPr>
+                <w:rFonts w:asciiTheme="minorHAnsi" w:hAnsiTheme="minorHAnsi" w:cstheme="minorHAnsi"/>
+                <w:sz w:val="28"/>
+                <w:szCs w:val="28"/>
+              </w:rPr>
+            </w:pPr>
+            <w:r>
+              <w:rPr>
+                <w:rFonts w:asciiTheme="minorHAnsi" w:hAnsiTheme="minorHAnsi" w:cstheme="minorHAnsi"/>
+                <w:b/>
+                <w:bCs/>
+                <w:sz w:val="28"/>
+                <w:szCs w:val="28"/>
+              </w:rPr>
+              <w:t>Local Information:</w:t>
+            </w:r>
+            <w:r>
+              <w:rPr>
+                <w:rFonts w:asciiTheme="minorHAnsi" w:hAnsiTheme="minorHAnsi" w:cstheme="minorHAnsi"/>
+                <w:sz w:val="28"/>
+                <w:szCs w:val="28"/>
+              </w:rPr>
+              <w:t xml:space="preserve"> Nodes communicate with their immediate neighbors to exchange information about the network topology and the location of the target node. This local information sharing allows nodes to make informed decisions about the direction to move in the network.</w:t>
+            </w:r>
+          </w:p>
+          <w:p>
+            <w:pPr>
+              <w:pStyle w:val="TableParagraph"/>
+              <w:ind w:left="-159"/>
+              <w:rPr>
+                <w:rFonts w:asciiTheme="minorHAnsi" w:hAnsiTheme="minorHAnsi" w:cstheme="minorHAnsi"/>
+                <w:sz w:val="28"/>
+                <w:szCs w:val="28"/>
+              </w:rPr>
+            </w:pPr>
+          </w:p>
+          <w:p>
+            <w:pPr>
+              <w:pStyle w:val="TableParagraph"/>
+              <w:numPr>
+                <w:ilvl w:val="0"/>
+                <w:numId w:val="12"/>
+              </w:numPr>
+              <w:ind w:left="561"/>
+              <w:rPr>
+                <w:rFonts w:asciiTheme="minorHAnsi" w:hAnsiTheme="minorHAnsi" w:cstheme="minorHAnsi"/>
+                <w:sz w:val="28"/>
+                <w:szCs w:val="28"/>
+              </w:rPr>
+            </w:pPr>
+            <w:r>
+              <w:rPr>
+                <w:rFonts w:asciiTheme="minorHAnsi" w:hAnsiTheme="minorHAnsi" w:cstheme="minorHAnsi"/>
+                <w:b/>
+                <w:bCs/>
+                <w:sz w:val="28"/>
+                <w:szCs w:val="28"/>
+              </w:rPr>
+              <w:t>Navigation Strategies:</w:t>
+            </w:r>
+            <w:r>
+              <w:rPr>
+                <w:rFonts w:asciiTheme="minorHAnsi" w:hAnsiTheme="minorHAnsi" w:cstheme="minorHAnsi"/>
+                <w:sz w:val="28"/>
+                <w:szCs w:val="28"/>
+              </w:rPr>
+              <w:t xml:space="preserve"> Nodes use various navigation strategies to search for the target node, such as random walks, greedy routing, or following paths with high connectivity. These strategies help nodes efficiently explore the network and locate the target node.</w:t>
+            </w:r>
+          </w:p>
+          <w:p>
+            <w:pPr>
+              <w:pStyle w:val="TableParagraph"/>
+              <w:ind w:left="-159"/>
+              <w:rPr>
+                <w:rFonts w:asciiTheme="minorHAnsi" w:hAnsiTheme="minorHAnsi" w:cstheme="minorHAnsi"/>
+                <w:sz w:val="28"/>
+                <w:szCs w:val="28"/>
+              </w:rPr>
+            </w:pPr>
+          </w:p>
+          <w:p>
+            <w:pPr>
+              <w:pStyle w:val="TableParagraph"/>
+              <w:numPr>
+                <w:ilvl w:val="0"/>
+                <w:numId w:val="12"/>
+              </w:numPr>
+              <w:ind w:left="561"/>
+              <w:rPr>
+                <w:rFonts w:asciiTheme="minorHAnsi" w:hAnsiTheme="minorHAnsi" w:cstheme="minorHAnsi"/>
+                <w:sz w:val="28"/>
+                <w:szCs w:val="28"/>
+              </w:rPr>
+            </w:pPr>
+            <w:r>
+              <w:rPr>
+                <w:rFonts w:asciiTheme="minorHAnsi" w:hAnsiTheme="minorHAnsi" w:cstheme="minorHAnsi"/>
+                <w:b/>
+                <w:bCs/>
+                <w:sz w:val="28"/>
+                <w:szCs w:val="28"/>
+              </w:rPr>
+              <w:t>Small World Phenomenon:</w:t>
+            </w:r>
+            <w:r>
+              <w:rPr>
+                <w:rFonts w:asciiTheme="minorHAnsi" w:hAnsiTheme="minorHAnsi" w:cstheme="minorHAnsi"/>
+                <w:sz w:val="28"/>
+                <w:szCs w:val="28"/>
+              </w:rPr>
+              <w:t xml:space="preserve"> The Small World Effect, characterized by the short average path length between nodes in a network, plays a crucial role in decentralized search. The presence of short paths enables nodes to reach distant targets through a small number of intermediate steps.</w:t>
+            </w:r>
+          </w:p>
+          <w:p>
+            <w:pPr>
+              <w:pStyle w:val="TableParagraph"/>
+              <w:ind w:left="-159"/>
+              <w:rPr>
+                <w:rFonts w:asciiTheme="minorHAnsi" w:hAnsiTheme="minorHAnsi" w:cstheme="minorHAnsi"/>
+                <w:sz w:val="28"/>
+                <w:szCs w:val="28"/>
+              </w:rPr>
+            </w:pPr>
+          </w:p>
+          <w:p>
+            <w:pPr>
+              <w:pStyle w:val="TableParagraph"/>
+              <w:numPr>
+                <w:ilvl w:val="0"/>
+                <w:numId w:val="12"/>
+              </w:numPr>
+              <w:ind w:left="561"/>
+              <w:rPr>
+                <w:rFonts w:asciiTheme="minorHAnsi" w:hAnsiTheme="minorHAnsi" w:cstheme="minorHAnsi"/>
+                <w:sz w:val="28"/>
+                <w:szCs w:val="28"/>
+              </w:rPr>
+            </w:pPr>
+            <w:r>
+              <w:rPr>
+                <w:rFonts w:asciiTheme="minorHAnsi" w:hAnsiTheme="minorHAnsi" w:cstheme="minorHAnsi"/>
+                <w:b/>
+                <w:bCs/>
+                <w:sz w:val="28"/>
+                <w:szCs w:val="28"/>
+              </w:rPr>
+              <w:t>Efficiency and Robustness:</w:t>
+            </w:r>
+            <w:r>
+              <w:rPr>
+                <w:rFonts w:asciiTheme="minorHAnsi" w:hAnsiTheme="minorHAnsi" w:cstheme="minorHAnsi"/>
+                <w:sz w:val="28"/>
+                <w:szCs w:val="28"/>
+              </w:rPr>
+              <w:t xml:space="preserve"> Decentralized search in networks with the Small World Effect is efficient and robust. Even without global knowledge of the network, nodes can navigate towards the target node quickly due to the interconnected nature of the network.</w:t>
+            </w:r>
+          </w:p>
+          <w:p>
+            <w:pPr>
+              <w:pStyle w:val="TableParagraph"/>
+              <w:ind w:left="-159"/>
+              <w:rPr>
+                <w:rFonts w:asciiTheme="minorHAnsi" w:hAnsiTheme="minorHAnsi" w:cstheme="minorHAnsi"/>
+                <w:sz w:val="28"/>
+                <w:szCs w:val="28"/>
+              </w:rPr>
+            </w:pPr>
+          </w:p>
+          <w:p>
+            <w:pPr>
+              <w:pStyle w:val="TableParagraph"/>
+              <w:numPr>
+                <w:ilvl w:val="0"/>
+                <w:numId w:val="12"/>
+              </w:numPr>
+              <w:ind w:left="561"/>
+              <w:rPr>
+                <w:rFonts w:asciiTheme="minorHAnsi" w:hAnsiTheme="minorHAnsi" w:cstheme="minorHAnsi"/>
+                <w:sz w:val="28"/>
+                <w:szCs w:val="28"/>
+              </w:rPr>
+            </w:pPr>
+            <w:r>
+              <w:rPr>
+                <w:rFonts w:asciiTheme="minorHAnsi" w:hAnsiTheme="minorHAnsi" w:cstheme="minorHAnsi"/>
+                <w:b/>
+                <w:bCs/>
+                <w:sz w:val="28"/>
+                <w:szCs w:val="28"/>
+              </w:rPr>
+              <w:t>Applications:</w:t>
+            </w:r>
+            <w:r>
+              <w:rPr>
+                <w:rFonts w:asciiTheme="minorHAnsi" w:hAnsiTheme="minorHAnsi" w:cstheme="minorHAnsi"/>
+                <w:sz w:val="28"/>
+                <w:szCs w:val="28"/>
+              </w:rPr>
+              <w:t xml:space="preserve"> Decentralized search in the Small World Effect has applications in various fields, such as information retrieval in social networks, routing in communication networks, and navigation in complex systems. Understanding decentralized search mechanisms can help optimize search algorithms and improve efficiency in networked systems.</w:t>
+            </w:r>
+          </w:p>
+          <w:p>
+            <w:pPr>
+              <w:pStyle w:val="TableParagraph"/>
+              <w:rPr>
+                <w:rFonts w:asciiTheme="minorHAnsi" w:hAnsiTheme="minorHAnsi" w:cstheme="minorHAnsi"/>
+                <w:sz w:val="28"/>
+                <w:szCs w:val="28"/>
+              </w:rPr>
+            </w:pPr>
+          </w:p>
+          <w:p>
+            <w:pPr>
+              <w:pStyle w:val="TableParagraph"/>
+              <w:rPr>
+                <w:rFonts w:asciiTheme="minorHAnsi" w:hAnsiTheme="minorHAnsi" w:cstheme="minorHAnsi"/>
+                <w:sz w:val="28"/>
+                <w:szCs w:val="28"/>
+              </w:rPr>
+            </w:pPr>
+            <w:r>
+              <w:rPr>
+                <w:rFonts w:asciiTheme="minorHAnsi" w:hAnsiTheme="minorHAnsi" w:cstheme="minorHAnsi"/>
+                <w:sz w:val="28"/>
+                <w:szCs w:val="28"/>
+              </w:rPr>
+              <w:t>In summary, decentralized search in the Small World Effect involves autonomous navigation of nodes in a network to locate a target node using local information and interactions. This approach leverages the interconnected nature of networks to efficiently search for targets without centralized control.</w:t>
             </w:r>
           </w:p>
         </w:tc>
@@ -8718,17 +10176,8 @@
         </w:rPr>
       </w:pPr>
     </w:p>
-    <w:p>
-      <w:pPr>
-        <w:rPr>
-          <w:rFonts w:asciiTheme="minorHAnsi" w:hAnsiTheme="minorHAnsi" w:cstheme="minorHAnsi"/>
-          <w:sz w:val="28"/>
-          <w:szCs w:val="28"/>
-        </w:rPr>
-      </w:pPr>
-    </w:p>
     <w:sectPr>
-      <w:pgSz w:w="11913" w:h="13608"/>
+      <w:pgSz w:w="11913" w:h="16443"/>
       <w:pgMar w:top="0" w:right="1480" w:bottom="0" w:left="697" w:header="720" w:footer="720" w:gutter="0"/>
       <w:cols w:space="720"/>
     </w:sectPr>
@@ -9288,6 +10737,96 @@
     </w:lvl>
   </w:abstractNum>
   <w:abstractNum w:abstractNumId="5" w15:restartNumberingAfterBreak="0">
+    <w:nsid w:val="27855FEE"/>
+    <w:multiLevelType w:val="hybridMultilevel"/>
+    <w:tmpl w:val="D21CF5C6"/>
+    <w:lvl w:ilvl="0" w:tplc="31088362">
+      <w:start w:val="1"/>
+      <w:numFmt w:val="decimal"/>
+      <w:lvlText w:val="%1."/>
+      <w:lvlJc w:val="left"/>
+      <w:pPr>
+        <w:ind w:left="921" w:hanging="360"/>
+      </w:pPr>
+      <w:rPr>
+        <w:b/>
+        <w:bCs/>
+      </w:rPr>
+    </w:lvl>
+    <w:lvl w:ilvl="1" w:tplc="40090019" w:tentative="1">
+      <w:start w:val="1"/>
+      <w:numFmt w:val="lowerLetter"/>
+      <w:lvlText w:val="%2."/>
+      <w:lvlJc w:val="left"/>
+      <w:pPr>
+        <w:ind w:left="1641" w:hanging="360"/>
+      </w:pPr>
+    </w:lvl>
+    <w:lvl w:ilvl="2" w:tplc="4009001B" w:tentative="1">
+      <w:start w:val="1"/>
+      <w:numFmt w:val="lowerRoman"/>
+      <w:lvlText w:val="%3."/>
+      <w:lvlJc w:val="right"/>
+      <w:pPr>
+        <w:ind w:left="2361" w:hanging="180"/>
+      </w:pPr>
+    </w:lvl>
+    <w:lvl w:ilvl="3" w:tplc="4009000F" w:tentative="1">
+      <w:start w:val="1"/>
+      <w:numFmt w:val="decimal"/>
+      <w:lvlText w:val="%4."/>
+      <w:lvlJc w:val="left"/>
+      <w:pPr>
+        <w:ind w:left="3081" w:hanging="360"/>
+      </w:pPr>
+    </w:lvl>
+    <w:lvl w:ilvl="4" w:tplc="40090019" w:tentative="1">
+      <w:start w:val="1"/>
+      <w:numFmt w:val="lowerLetter"/>
+      <w:lvlText w:val="%5."/>
+      <w:lvlJc w:val="left"/>
+      <w:pPr>
+        <w:ind w:left="3801" w:hanging="360"/>
+      </w:pPr>
+    </w:lvl>
+    <w:lvl w:ilvl="5" w:tplc="4009001B" w:tentative="1">
+      <w:start w:val="1"/>
+      <w:numFmt w:val="lowerRoman"/>
+      <w:lvlText w:val="%6."/>
+      <w:lvlJc w:val="right"/>
+      <w:pPr>
+        <w:ind w:left="4521" w:hanging="180"/>
+      </w:pPr>
+    </w:lvl>
+    <w:lvl w:ilvl="6" w:tplc="4009000F" w:tentative="1">
+      <w:start w:val="1"/>
+      <w:numFmt w:val="decimal"/>
+      <w:lvlText w:val="%7."/>
+      <w:lvlJc w:val="left"/>
+      <w:pPr>
+        <w:ind w:left="5241" w:hanging="360"/>
+      </w:pPr>
+    </w:lvl>
+    <w:lvl w:ilvl="7" w:tplc="40090019" w:tentative="1">
+      <w:start w:val="1"/>
+      <w:numFmt w:val="lowerLetter"/>
+      <w:lvlText w:val="%8."/>
+      <w:lvlJc w:val="left"/>
+      <w:pPr>
+        <w:ind w:left="5961" w:hanging="360"/>
+      </w:pPr>
+    </w:lvl>
+    <w:lvl w:ilvl="8" w:tplc="4009001B" w:tentative="1">
+      <w:start w:val="1"/>
+      <w:numFmt w:val="lowerRoman"/>
+      <w:lvlText w:val="%9."/>
+      <w:lvlJc w:val="right"/>
+      <w:pPr>
+        <w:ind w:left="6681" w:hanging="180"/>
+      </w:pPr>
+    </w:lvl>
+  </w:abstractNum>
+  <w:abstractNum w:abstractNumId="6" w15:restartNumberingAfterBreak="0">
     <w:nsid w:val="2BF17CD9"/>
     <w:multiLevelType w:val="multilevel"/>
     <w:tmpl w:val="DAAA4F66"/>
@@ -9436,7 +10975,7 @@
       </w:rPr>
     </w:lvl>
   </w:abstractNum>
-  <w:abstractNum w:abstractNumId="6" w15:restartNumberingAfterBreak="0">
+  <w:abstractNum w:abstractNumId="7" w15:restartNumberingAfterBreak="0">
     <w:nsid w:val="3CBA6353"/>
     <w:multiLevelType w:val="multilevel"/>
     <w:tmpl w:val="81E0D864"/>
@@ -9585,7 +11124,7 @@
       </w:rPr>
     </w:lvl>
   </w:abstractNum>
-  <w:abstractNum w:abstractNumId="7" w15:restartNumberingAfterBreak="0">
+  <w:abstractNum w:abstractNumId="8" w15:restartNumberingAfterBreak="0">
     <w:nsid w:val="4C080273"/>
     <w:multiLevelType w:val="multilevel"/>
     <w:tmpl w:val="64B84C04"/>
@@ -9698,7 +11237,350 @@
       </w:pPr>
     </w:lvl>
   </w:abstractNum>
-  <w:abstractNum w:abstractNumId="8" w15:restartNumberingAfterBreak="0">
+  <w:abstractNum w:abstractNumId="9" w15:restartNumberingAfterBreak="0">
+    <w:nsid w:val="4CEF31E0"/>
+    <w:multiLevelType w:val="multilevel"/>
+    <w:tmpl w:val="A6DE0444"/>
+    <w:lvl w:ilvl="0">
+      <w:start w:val="1"/>
+      <w:numFmt w:val="decimal"/>
+      <w:lvlText w:val="%1."/>
+      <w:lvlJc w:val="left"/>
+      <w:pPr>
+        <w:tabs>
+          <w:tab w:val="num" w:pos="720"/>
+        </w:tabs>
+        <w:ind w:left="720" w:hanging="360"/>
+      </w:pPr>
+    </w:lvl>
+    <w:lvl w:ilvl="1">
+      <w:start w:val="1"/>
+      <w:numFmt w:val="bullet"/>
+      <w:lvlText w:val=""/>
+      <w:lvlJc w:val="left"/>
+      <w:pPr>
+        <w:tabs>
+          <w:tab w:val="num" w:pos="1440"/>
+        </w:tabs>
+        <w:ind w:left="1440" w:hanging="360"/>
+      </w:pPr>
+      <w:rPr>
+        <w:rFonts w:ascii="Symbol" w:hAnsi="Symbol" w:hint="default"/>
+        <w:sz w:val="20"/>
+      </w:rPr>
+    </w:lvl>
+    <w:lvl w:ilvl="2" w:tentative="1">
+      <w:start w:val="1"/>
+      <w:numFmt w:val="decimal"/>
+      <w:lvlText w:val="%3."/>
+      <w:lvlJc w:val="left"/>
+      <w:pPr>
+        <w:tabs>
+          <w:tab w:val="num" w:pos="2160"/>
+        </w:tabs>
+        <w:ind w:left="2160" w:hanging="360"/>
+      </w:pPr>
+    </w:lvl>
+    <w:lvl w:ilvl="3" w:tentative="1">
+      <w:start w:val="1"/>
+      <w:numFmt w:val="decimal"/>
+      <w:lvlText w:val="%4."/>
+      <w:lvlJc w:val="left"/>
+      <w:pPr>
+        <w:tabs>
+          <w:tab w:val="num" w:pos="2880"/>
+        </w:tabs>
+        <w:ind w:left="2880" w:hanging="360"/>
+      </w:pPr>
+    </w:lvl>
+    <w:lvl w:ilvl="4" w:tentative="1">
+      <w:start w:val="1"/>
+      <w:numFmt w:val="decimal"/>
+      <w:lvlText w:val="%5."/>
+      <w:lvlJc w:val="left"/>
+      <w:pPr>
+        <w:tabs>
+          <w:tab w:val="num" w:pos="3600"/>
+        </w:tabs>
+        <w:ind w:left="3600" w:hanging="360"/>
+      </w:pPr>
+    </w:lvl>
+    <w:lvl w:ilvl="5" w:tentative="1">
+      <w:start w:val="1"/>
+      <w:numFmt w:val="decimal"/>
+      <w:lvlText w:val="%6."/>
+      <w:lvlJc w:val="left"/>
+      <w:pPr>
+        <w:tabs>
+          <w:tab w:val="num" w:pos="4320"/>
+        </w:tabs>
+        <w:ind w:left="4320" w:hanging="360"/>
+      </w:pPr>
+    </w:lvl>
+    <w:lvl w:ilvl="6" w:tentative="1">
+      <w:start w:val="1"/>
+      <w:numFmt w:val="decimal"/>
+      <w:lvlText w:val="%7."/>
+      <w:lvlJc w:val="left"/>
+      <w:pPr>
+        <w:tabs>
+          <w:tab w:val="num" w:pos="5040"/>
+        </w:tabs>
+        <w:ind w:left="5040" w:hanging="360"/>
+      </w:pPr>
+    </w:lvl>
+    <w:lvl w:ilvl="7" w:tentative="1">
+      <w:start w:val="1"/>
+      <w:numFmt w:val="decimal"/>
+      <w:lvlText w:val="%8."/>
+      <w:lvlJc w:val="left"/>
+      <w:pPr>
+        <w:tabs>
+          <w:tab w:val="num" w:pos="5760"/>
+        </w:tabs>
+        <w:ind w:left="5760" w:hanging="360"/>
+      </w:pPr>
+    </w:lvl>
+    <w:lvl w:ilvl="8" w:tentative="1">
+      <w:start w:val="1"/>
+      <w:numFmt w:val="decimal"/>
+      <w:lvlText w:val="%9."/>
+      <w:lvlJc w:val="left"/>
+      <w:pPr>
+        <w:tabs>
+          <w:tab w:val="num" w:pos="6480"/>
+        </w:tabs>
+        <w:ind w:left="6480" w:hanging="360"/>
+      </w:pPr>
+    </w:lvl>
+  </w:abstractNum>
+  <w:abstractNum w:abstractNumId="10" w15:restartNumberingAfterBreak="0">
+    <w:nsid w:val="61C164AF"/>
+    <w:multiLevelType w:val="multilevel"/>
+    <w:tmpl w:val="A6DE0444"/>
+    <w:lvl w:ilvl="0">
+      <w:start w:val="1"/>
+      <w:numFmt w:val="decimal"/>
+      <w:lvlText w:val="%1."/>
+      <w:lvlJc w:val="left"/>
+      <w:pPr>
+        <w:tabs>
+          <w:tab w:val="num" w:pos="720"/>
+        </w:tabs>
+        <w:ind w:left="720" w:hanging="360"/>
+      </w:pPr>
+    </w:lvl>
+    <w:lvl w:ilvl="1" w:tentative="1">
+      <w:start w:val="1"/>
+      <w:numFmt w:val="decimal"/>
+      <w:lvlText w:val="%2."/>
+      <w:lvlJc w:val="left"/>
+      <w:pPr>
+        <w:tabs>
+          <w:tab w:val="num" w:pos="1440"/>
+        </w:tabs>
+        <w:ind w:left="1440" w:hanging="360"/>
+      </w:pPr>
+    </w:lvl>
+    <w:lvl w:ilvl="2" w:tentative="1">
+      <w:start w:val="1"/>
+      <w:numFmt w:val="decimal"/>
+      <w:lvlText w:val="%3."/>
+      <w:lvlJc w:val="left"/>
+      <w:pPr>
+        <w:tabs>
+          <w:tab w:val="num" w:pos="2160"/>
+        </w:tabs>
+        <w:ind w:left="2160" w:hanging="360"/>
+      </w:pPr>
+    </w:lvl>
+    <w:lvl w:ilvl="3" w:tentative="1">
+      <w:start w:val="1"/>
+      <w:numFmt w:val="decimal"/>
+      <w:lvlText w:val="%4."/>
+      <w:lvlJc w:val="left"/>
+      <w:pPr>
+        <w:tabs>
+          <w:tab w:val="num" w:pos="2880"/>
+        </w:tabs>
+        <w:ind w:left="2880" w:hanging="360"/>
+      </w:pPr>
+    </w:lvl>
+    <w:lvl w:ilvl="4" w:tentative="1">
+      <w:start w:val="1"/>
+      <w:numFmt w:val="decimal"/>
+      <w:lvlText w:val="%5."/>
+      <w:lvlJc w:val="left"/>
+      <w:pPr>
+        <w:tabs>
+          <w:tab w:val="num" w:pos="3600"/>
+        </w:tabs>
+        <w:ind w:left="3600" w:hanging="360"/>
+      </w:pPr>
+    </w:lvl>
+    <w:lvl w:ilvl="5" w:tentative="1">
+      <w:start w:val="1"/>
+      <w:numFmt w:val="decimal"/>
+      <w:lvlText w:val="%6."/>
+      <w:lvlJc w:val="left"/>
+      <w:pPr>
+        <w:tabs>
+          <w:tab w:val="num" w:pos="4320"/>
+        </w:tabs>
+        <w:ind w:left="4320" w:hanging="360"/>
+      </w:pPr>
+    </w:lvl>
+    <w:lvl w:ilvl="6" w:tentative="1">
+      <w:start w:val="1"/>
+      <w:numFmt w:val="decimal"/>
+      <w:lvlText w:val="%7."/>
+      <w:lvlJc w:val="left"/>
+      <w:pPr>
+        <w:tabs>
+          <w:tab w:val="num" w:pos="5040"/>
+        </w:tabs>
+        <w:ind w:left="5040" w:hanging="360"/>
+      </w:pPr>
+    </w:lvl>
+    <w:lvl w:ilvl="7" w:tentative="1">
+      <w:start w:val="1"/>
+      <w:numFmt w:val="decimal"/>
+      <w:lvlText w:val="%8."/>
+      <w:lvlJc w:val="left"/>
+      <w:pPr>
+        <w:tabs>
+          <w:tab w:val="num" w:pos="5760"/>
+        </w:tabs>
+        <w:ind w:left="5760" w:hanging="360"/>
+      </w:pPr>
+    </w:lvl>
+    <w:lvl w:ilvl="8" w:tentative="1">
+      <w:start w:val="1"/>
+      <w:numFmt w:val="decimal"/>
+      <w:lvlText w:val="%9."/>
+      <w:lvlJc w:val="left"/>
+      <w:pPr>
+        <w:tabs>
+          <w:tab w:val="num" w:pos="6480"/>
+        </w:tabs>
+        <w:ind w:left="6480" w:hanging="360"/>
+      </w:pPr>
+    </w:lvl>
+  </w:abstractNum>
+  <w:abstractNum w:abstractNumId="11" w15:restartNumberingAfterBreak="0">
+    <w:nsid w:val="62DA1315"/>
+    <w:multiLevelType w:val="multilevel"/>
+    <w:tmpl w:val="91A615BA"/>
+    <w:lvl w:ilvl="0">
+      <w:start w:val="1"/>
+      <w:numFmt w:val="decimal"/>
+      <w:lvlText w:val="%1."/>
+      <w:lvlJc w:val="left"/>
+      <w:pPr>
+        <w:tabs>
+          <w:tab w:val="num" w:pos="720"/>
+        </w:tabs>
+        <w:ind w:left="720" w:hanging="360"/>
+      </w:pPr>
+    </w:lvl>
+    <w:lvl w:ilvl="1" w:tentative="1">
+      <w:start w:val="1"/>
+      <w:numFmt w:val="decimal"/>
+      <w:lvlText w:val="%2."/>
+      <w:lvlJc w:val="left"/>
+      <w:pPr>
+        <w:tabs>
+          <w:tab w:val="num" w:pos="1440"/>
+        </w:tabs>
+        <w:ind w:left="1440" w:hanging="360"/>
+      </w:pPr>
+    </w:lvl>
+    <w:lvl w:ilvl="2" w:tentative="1">
+      <w:start w:val="1"/>
+      <w:numFmt w:val="decimal"/>
+      <w:lvlText w:val="%3."/>
+      <w:lvlJc w:val="left"/>
+      <w:pPr>
+        <w:tabs>
+          <w:tab w:val="num" w:pos="2160"/>
+        </w:tabs>
+        <w:ind w:left="2160" w:hanging="360"/>
+      </w:pPr>
+    </w:lvl>
+    <w:lvl w:ilvl="3" w:tentative="1">
+      <w:start w:val="1"/>
+      <w:numFmt w:val="decimal"/>
+      <w:lvlText w:val="%4."/>
+      <w:lvlJc w:val="left"/>
+      <w:pPr>
+        <w:tabs>
+          <w:tab w:val="num" w:pos="2880"/>
+        </w:tabs>
+        <w:ind w:left="2880" w:hanging="360"/>
+      </w:pPr>
+    </w:lvl>
+    <w:lvl w:ilvl="4" w:tentative="1">
+      <w:start w:val="1"/>
+      <w:numFmt w:val="decimal"/>
+      <w:lvlText w:val="%5."/>
+      <w:lvlJc w:val="left"/>
+      <w:pPr>
+        <w:tabs>
+          <w:tab w:val="num" w:pos="3600"/>
+        </w:tabs>
+        <w:ind w:left="3600" w:hanging="360"/>
+      </w:pPr>
+    </w:lvl>
+    <w:lvl w:ilvl="5" w:tentative="1">
+      <w:start w:val="1"/>
+      <w:numFmt w:val="decimal"/>
+      <w:lvlText w:val="%6."/>
+      <w:lvlJc w:val="left"/>
+      <w:pPr>
+        <w:tabs>
+          <w:tab w:val="num" w:pos="4320"/>
+        </w:tabs>
+        <w:ind w:left="4320" w:hanging="360"/>
+      </w:pPr>
+    </w:lvl>
+    <w:lvl w:ilvl="6" w:tentative="1">
+      <w:start w:val="1"/>
+      <w:numFmt w:val="decimal"/>
+      <w:lvlText w:val="%7."/>
+      <w:lvlJc w:val="left"/>
+      <w:pPr>
+        <w:tabs>
+          <w:tab w:val="num" w:pos="5040"/>
+        </w:tabs>
+        <w:ind w:left="5040" w:hanging="360"/>
+      </w:pPr>
+    </w:lvl>
+    <w:lvl w:ilvl="7" w:tentative="1">
+      <w:start w:val="1"/>
+      <w:numFmt w:val="decimal"/>
+      <w:lvlText w:val="%8."/>
+      <w:lvlJc w:val="left"/>
+      <w:pPr>
+        <w:tabs>
+          <w:tab w:val="num" w:pos="5760"/>
+        </w:tabs>
+        <w:ind w:left="5760" w:hanging="360"/>
+      </w:pPr>
+    </w:lvl>
+    <w:lvl w:ilvl="8" w:tentative="1">
+      <w:start w:val="1"/>
+      <w:numFmt w:val="decimal"/>
+      <w:lvlText w:val="%9."/>
+      <w:lvlJc w:val="left"/>
+      <w:pPr>
+        <w:tabs>
+          <w:tab w:val="num" w:pos="6480"/>
+        </w:tabs>
+        <w:ind w:left="6480" w:hanging="360"/>
+      </w:pPr>
+    </w:lvl>
+  </w:abstractNum>
+  <w:abstractNum w:abstractNumId="12" w15:restartNumberingAfterBreak="0">
     <w:nsid w:val="6B1E1D7C"/>
     <w:multiLevelType w:val="hybridMultilevel"/>
     <w:tmpl w:val="8DAA4998"/>
@@ -9785,22 +11667,22 @@
     </w:lvl>
   </w:abstractNum>
   <w:num w:numId="1" w16cid:durableId="1594511070">
-    <w:abstractNumId w:val="8"/>
+    <w:abstractNumId w:val="12"/>
   </w:num>
   <w:num w:numId="2" w16cid:durableId="115488651">
     <w:abstractNumId w:val="1"/>
   </w:num>
   <w:num w:numId="3" w16cid:durableId="2127967736">
-    <w:abstractNumId w:val="6"/>
+    <w:abstractNumId w:val="7"/>
   </w:num>
   <w:num w:numId="4" w16cid:durableId="644355379">
-    <w:abstractNumId w:val="5"/>
+    <w:abstractNumId w:val="6"/>
   </w:num>
   <w:num w:numId="5" w16cid:durableId="1101294776">
     <w:abstractNumId w:val="2"/>
   </w:num>
   <w:num w:numId="6" w16cid:durableId="1375278192">
-    <w:abstractNumId w:val="7"/>
+    <w:abstractNumId w:val="8"/>
   </w:num>
   <w:num w:numId="7" w16cid:durableId="2122609038">
     <w:abstractNumId w:val="0"/>
@@ -9810,6 +11692,18 @@
   </w:num>
   <w:num w:numId="9" w16cid:durableId="1976057526">
     <w:abstractNumId w:val="4"/>
+  </w:num>
+  <w:num w:numId="10" w16cid:durableId="148983231">
+    <w:abstractNumId w:val="10"/>
+  </w:num>
+  <w:num w:numId="11" w16cid:durableId="1199506527">
+    <w:abstractNumId w:val="11"/>
+  </w:num>
+  <w:num w:numId="12" w16cid:durableId="2119062177">
+    <w:abstractNumId w:val="5"/>
+  </w:num>
+  <w:num w:numId="13" w16cid:durableId="155808266">
+    <w:abstractNumId w:val="9"/>
   </w:num>
 </w:numbering>
 </file>
@@ -10206,7 +12100,7 @@
   <w:style w:type="paragraph" w:default="1" w:styleId="Normal">
     <w:name w:val="Normal"/>
     <w:qFormat/>
-    <w:rsid w:val="00685E30"/>
+    <w:rsid w:val="00557900"/>
     <w:pPr>
       <w:widowControl w:val="0"/>
       <w:autoSpaceDE w:val="0"/>

</xml_diff>